<commit_message>
build_docx_mdpi_styled: define dangling styles found in verification
Verifying draft_mdpi_styled.docx exposed two referenced-but-undefined
styles: the table style "Table" (4x) and the inline-code char style
"VerbatimChar" (8x). Using the template as pandoc's reference doc replaces
pandoc's styles.xml, dropping these helper styles, which would make Word
prompt to "repair" the file. Post-process now scans document.xml for any
referenced style absent from styles.xml and appends a minimal definition of
the correct type (paragraph/character/table).

Verified clean: 0 dangling style refs, 0 dangling relationships, png
content-type present, headers/footers resolve, XML well-formed, and
python-docx parses it fully (255 paragraphs, 4 tables, 2078 runs, 8 inline
images) with all paragraph styles resolving to MDPI_* names.

Co-Authored-By: Claude Opus 4.8 (1M context) <noreply@anthropic.com>
</commit_message>
<xml_diff>
--- a/manuscript/draft_mdpi_styled.docx
+++ b/manuscript/draft_mdpi_styled.docx
@@ -24323,6 +24323,12 @@
     <w:basedOn w:val="VerbatimChar"/>
     <w:rPr/>
   </w:style>
+  <w:style w:type="character" w:styleId="VerbatimChar">
+    <w:name w:val="VerbatimChar"/>
+  </w:style>
+  <w:style w:type="table" w:styleId="Table">
+    <w:name w:val="Table"/>
+  </w:style>
 </w:styles>
 </file>
 

</xml_diff>